<commit_message>
Draw the geoelectric section at the soundings' own scale
The section divided the profile equally between its columns, so two
Rokel soundings 20.7 km apart came out as two columns 8 km wide - each
claiming to have measured 8 km of ground. A column is now as wide as
the sounding's lateral reach, capped so neighbours never overlap.

Where the gap between adjacent soundings dwarfs that reach, the figure
says in red how many times over. At Rokel the widest gap is 259 times
the 80 m the soundings reached, so the dashed correlations across it
join two measurements with nothing between them.

Also: the locator inset is opaque, because at 0.95 the chiefdom names
underneath showed through it as ghost text, and it now counts those
names when picking which corner to sit in - a map with no survey points
on it still has a corner full of writing.

Co-Authored-By: Claude Opus 5 <noreply@anthropic.com>
Claude-Session: https://claude.ai/code/session_01Jn6sZnSqfYoaRQW4dizQrv
</commit_message>
<xml_diff>
--- a/examples/projects/dr_timbo/reports/Dr_Timbo_Borehole_Completion_Report.docx
+++ b/examples/projects/dr_timbo/reports/Dr_Timbo_Borehole_Completion_Report.docx
@@ -294,8 +294,59 @@
       <w:r>
         <w:drawing>
           <wp:inline xmlns:a="http://schemas.openxmlformats.org/drawingml/2006/main" xmlns:pic="http://schemas.openxmlformats.org/drawingml/2006/picture">
+            <wp:extent cx="5040000" cy="4712835"/>
+            <wp:docPr id="1" name="Picture 1"/>
+            <wp:cNvGraphicFramePr>
+              <a:graphicFrameLocks noChangeAspect="1"/>
+            </wp:cNvGraphicFramePr>
+            <a:graphic>
+              <a:graphicData uri="http://schemas.openxmlformats.org/drawingml/2006/picture">
+                <pic:pic>
+                  <pic:nvPicPr>
+                    <pic:cNvPr id="0" name="study_area_map_8p3260_13p0991.png"/>
+                    <pic:cNvPicPr/>
+                  </pic:nvPicPr>
+                  <pic:blipFill>
+                    <a:blip r:embed="rId10"/>
+                    <a:stretch>
+                      <a:fillRect/>
+                    </a:stretch>
+                  </pic:blipFill>
+                  <pic:spPr>
+                    <a:xfrm>
+                      <a:off x="0" y="0"/>
+                      <a:ext cx="5040000" cy="4712835"/>
+                    </a:xfrm>
+                    <a:prstGeom prst="rect"/>
+                  </pic:spPr>
+                </pic:pic>
+              </a:graphicData>
+            </a:graphic>
+          </wp:inline>
+        </w:drawing>
+      </w:r>
+    </w:p>
+    <w:p>
+      <w:pPr>
+        <w:jc w:val="center"/>
+      </w:pPr>
+      <w:r>
+        <w:rPr>
+          <w:b/>
+          <w:sz w:val="18"/>
+        </w:rPr>
+        <w:t>Figure 1. Study area at Western Area Rural district, with its location in Sierra Leone inset. Boundaries from geoBoundaries (CC BY 4.0).</w:t>
+      </w:r>
+    </w:p>
+    <w:p>
+      <w:pPr>
+        <w:jc w:val="center"/>
+      </w:pPr>
+      <w:r>
+        <w:drawing>
+          <wp:inline xmlns:a="http://schemas.openxmlformats.org/drawingml/2006/main" xmlns:pic="http://schemas.openxmlformats.org/drawingml/2006/picture">
             <wp:extent cx="5040000" cy="4627023"/>
-            <wp:docPr id="1" name="Picture 1"/>
+            <wp:docPr id="2" name="Picture 2"/>
             <wp:cNvGraphicFramePr>
               <a:graphicFrameLocks noChangeAspect="1"/>
             </wp:cNvGraphicFramePr>
@@ -307,7 +358,7 @@
                     <pic:cNvPicPr/>
                   </pic:nvPicPr>
                   <pic:blipFill>
-                    <a:blip r:embed="rId10"/>
+                    <a:blip r:embed="rId11"/>
                     <a:stretch>
                       <a:fillRect/>
                     </a:stretch>
@@ -335,7 +386,7 @@
           <w:b/>
           <w:sz w:val="18"/>
         </w:rPr>
-        <w:t>Figure 1. Location of Western Area Rural district. Boundaries from geoBoundaries (CC BY 4.0).</w:t>
+        <w:t>Figure 2. Location of Western Area Rural district. Boundaries from geoBoundaries (CC BY 4.0).</w:t>
       </w:r>
     </w:p>
     <w:p>
@@ -2630,7 +2681,7 @@
         <w:drawing>
           <wp:inline xmlns:a="http://schemas.openxmlformats.org/drawingml/2006/main" xmlns:pic="http://schemas.openxmlformats.org/drawingml/2006/picture">
             <wp:extent cx="4860000" cy="7363038"/>
-            <wp:docPr id="2" name="Picture 2"/>
+            <wp:docPr id="3" name="Picture 3"/>
             <wp:cNvGraphicFramePr>
               <a:graphicFrameLocks noChangeAspect="1"/>
             </wp:cNvGraphicFramePr>
@@ -2642,7 +2693,7 @@
                     <pic:cNvPicPr/>
                   </pic:nvPicPr>
                   <pic:blipFill>
-                    <a:blip r:embed="rId11"/>
+                    <a:blip r:embed="rId12"/>
                     <a:stretch>
                       <a:fillRect/>
                     </a:stretch>
@@ -2670,7 +2721,7 @@
           <w:b/>
           <w:sz w:val="18"/>
         </w:rPr>
-        <w:t>Figure 2. As-built borehole design with lithology and construction columns.</w:t>
+        <w:t>Figure 3. As-built borehole design with lithology and construction columns.</w:t>
       </w:r>
     </w:p>
     <w:p>
@@ -3021,7 +3072,7 @@
         <w:drawing>
           <wp:inline xmlns:a="http://schemas.openxmlformats.org/drawingml/2006/main" xmlns:pic="http://schemas.openxmlformats.org/drawingml/2006/picture">
             <wp:extent cx="5400000" cy="2702179"/>
-            <wp:docPr id="3" name="Picture 3"/>
+            <wp:docPr id="4" name="Picture 4"/>
             <wp:cNvGraphicFramePr>
               <a:graphicFrameLocks noChangeAspect="1"/>
             </wp:cNvGraphicFramePr>
@@ -3033,7 +3084,7 @@
                     <pic:cNvPicPr/>
                   </pic:nvPicPr>
                   <pic:blipFill>
-                    <a:blip r:embed="rId12"/>
+                    <a:blip r:embed="rId13"/>
                     <a:stretch>
                       <a:fillRect/>
                     </a:stretch>
@@ -3061,7 +3112,7 @@
           <w:b/>
           <w:sz w:val="18"/>
         </w:rPr>
-        <w:t>Figure 3. Constant discharge test and recovery record.</w:t>
+        <w:t>Figure 4. Constant discharge test and recovery record.</w:t>
       </w:r>
     </w:p>
     <w:p>

</xml_diff>

<commit_message>
Keep a yield inside its own range, and regenerate for the hydraulics fixes
The envelope took its low and high from the corners of the assumption
ranges only, and the corners do not always bracket the central figure:
with the levels in doubt, a central yield of 0.0067 m3/h was printed
beside a range starting at 0.0068. The central figure is now part of the
range in both engines.

The parity reference, the example reports, the demo page and the worker
are regenerated for the hydraulics fixes: Dr Timbo's yield range is
"0.22 to 0.71" rather than "0.28 to 1.2", which took its top from the
recovery line the analysis had refused.

Co-Authored-By: Claude Opus 5.5 <noreply@anthropic.com>
Claude-Session: https://claude.ai/code/session_01N238PgxrG7srpyEYS39Tt6
</commit_message>
<xml_diff>
--- a/examples/projects/dr_timbo/reports/Dr_Timbo_Borehole_Completion_Report.docx
+++ b/examples/projects/dr_timbo/reports/Dr_Timbo_Borehole_Completion_Report.docx
@@ -167,7 +167,7 @@
         <w:pStyle w:val="ListBullet"/>
       </w:pPr>
       <w:r>
-        <w:t>Yield established: The safe yield of 0.39 m3/h (0.28 to 1.2) is indicative, not established: the test pumped for 30 minutes, below the 240 needed to see late-time behaviour, so the yield is extrapolated 4.2 log cycles of time; the whole test lies inside the 117-minute casing-storage period, so its drawdown is the borehole emptying rather than the aquifer responding; no transmissivity method fitted to standard and the Cooper-Jacob value is adopted as the best available.</w:t>
+        <w:t>Yield established: The safe yield of 0.39 m3/h (0.22 to 0.71) is indicative, not established: the test pumped for 30 minutes, below the 240 needed to see late-time behaviour, so the yield is extrapolated 4.2 log cycles of time; the whole test lies inside the 117-minute casing-storage period, so its drawdown is the borehole emptying rather than the aquifer responding; no transmissivity method fitted to standard and the Cooper-Jacob value is adopted as the best available.</w:t>
       </w:r>
     </w:p>
     <w:p>
@@ -3562,7 +3562,7 @@
               <w:rPr>
                 <w:sz w:val="19"/>
               </w:rPr>
-              <w:t>0.39 m3/h (0.28 to 1.2)</w:t>
+              <w:t>0.39 m3/h (0.22 to 0.71)</w:t>
             </w:r>
           </w:p>
         </w:tc>

</xml_diff>